<commit_message>
audit content 2.4 synthetic course quality
</commit_message>
<xml_diff>
--- a/教案生成器/lesson-plan-docx-generator/docs/evidence/issue-73-synthetic-course/artifacts/教案01_项目一：线性结构与受限容器_线性表的逻辑结构、顺序存储与复杂度.docx
+++ b/教案生成器/lesson-plan-docx-generator/docs/evidence/issue-73-synthetic-course/artifacts/教案01_项目一：线性结构与受限容器_线性表的逻辑结构、顺序存储与复杂度.docx
@@ -4986,7 +4986,7 @@
                 <w:sz w:val="24"/>
                 <w:szCs w:val="24"/>
               </w:rPr>
-              <w:t>小组实训</w:t>
+              <w:t>讲授+情境</w:t>
             </w:r>
           </w:p>
         </w:tc>
@@ -5200,7 +5200,7 @@
                 <w:sz w:val="24"/>
                 <w:szCs w:val="24"/>
               </w:rPr>
-              <w:t>小组实训</w:t>
+              <w:t>教师示范+全班推演</w:t>
             </w:r>
           </w:p>
         </w:tc>
@@ -5426,7 +5426,7 @@
                 <w:sz w:val="24"/>
                 <w:szCs w:val="24"/>
               </w:rPr>
-              <w:t>小组实训</w:t>
+              <w:t>个人纸笔分析</w:t>
             </w:r>
           </w:p>
         </w:tc>
@@ -5658,7 +5658,7 @@
                 <w:sz w:val="24"/>
                 <w:szCs w:val="24"/>
               </w:rPr>
-              <w:t>小组实训</w:t>
+              <w:t>小组讨论</w:t>
             </w:r>
           </w:p>
         </w:tc>
@@ -5893,7 +5893,7 @@
                 <w:sz w:val="24"/>
                 <w:szCs w:val="24"/>
               </w:rPr>
-              <w:t>小组实训</w:t>
+              <w:t>小组分析单整理</w:t>
             </w:r>
           </w:p>
         </w:tc>
@@ -6118,7 +6118,7 @@
                 <w:sz w:val="24"/>
                 <w:szCs w:val="24"/>
               </w:rPr>
-              <w:t>小组实训</w:t>
+              <w:t>同伴互核</w:t>
             </w:r>
           </w:p>
         </w:tc>
@@ -6342,7 +6342,7 @@
                 <w:sz w:val="24"/>
                 <w:szCs w:val="24"/>
               </w:rPr>
-              <w:t>小组实训</w:t>
+              <w:t>讲授+问答</w:t>
             </w:r>
           </w:p>
         </w:tc>

</xml_diff>